<commit_message>
fix: pertahankan cap stempel resmi
</commit_message>
<xml_diff>
--- a/analysis/test_output.docx
+++ b/analysis/test_output.docx
@@ -5105,31 +5105,6 @@
     <w:p>
       <w:pPr>
         <w:spacing w:after="120" w:line="276" w:lineRule="auto"/>
-        <w:ind w:left="425.19685039370086" w:firstLine="294.80314960629914"/>
-        <w:jc w:val="both"/>
-        <w:rPr>
-          <w:rFonts w:ascii="Arial" w:cs="Arial" w:eastAsia="Arial" w:hAnsi="Arial"/>
-          <w:i w:val="1"/>
-          <w:iCs w:val="1"/>
-          <w:sz w:val="22"/>
-          <w:szCs w:val="22"/>
-        </w:rPr>
-      </w:pPr>
-      <w:r>
-        <w:rPr>
-          <w:rFonts w:ascii="Arial" w:cs="Arial" w:eastAsia="Arial" w:hAnsi="Arial"/>
-          <w:i w:val="1"/>
-          <w:iCs w:val="1"/>
-          <w:sz w:val="22"/>
-          <w:szCs w:val="22"/>
-          <w:rtl w:val="0"/>
-        </w:rPr>
-        <w:t xml:space="preserve">*akun yang diperkenankan Belanja Bahan, Narasumber, Transport Lokal</w:t>
-      </w:r>
-    </w:p>
-    <w:p>
-      <w:pPr>
-        <w:spacing w:after="120" w:line="276" w:lineRule="auto"/>
         <w:ind w:left="425.19685039370086" w:firstLine="0"/>
         <w:jc w:val="both"/>
         <w:rPr>
@@ -5557,31 +5532,6 @@
     <w:p>
       <w:pPr>
         <w:spacing w:after="120" w:line="276" w:lineRule="auto"/>
-        <w:ind w:left="708.6614173228347" w:firstLine="0"/>
-        <w:jc w:val="both"/>
-        <w:rPr>
-          <w:rFonts w:ascii="Arial" w:cs="Arial" w:eastAsia="Arial" w:hAnsi="Arial"/>
-          <w:i w:val="1"/>
-          <w:iCs w:val="1"/>
-          <w:sz w:val="22"/>
-          <w:szCs w:val="22"/>
-        </w:rPr>
-      </w:pPr>
-      <w:r>
-        <w:rPr>
-          <w:rFonts w:ascii="Arial" w:cs="Arial" w:eastAsia="Arial" w:hAnsi="Arial"/>
-          <w:i w:val="1"/>
-          <w:iCs w:val="1"/>
-          <w:sz w:val="22"/>
-          <w:szCs w:val="22"/>
-          <w:rtl w:val="0"/>
-        </w:rPr>
-        <w:t xml:space="preserve">*akun yang diperkenankan Belanja Bahan, Narasumber, Transport Lokal, Perjalanan Dinas PAket Meeting, Perjalanan Dinas Biasa, Belanja Jasa Lainnya (PJP), Belanja Jasa Konsultan. </w:t>
-      </w:r>
-    </w:p>
-    <w:p>
-      <w:pPr>
-        <w:spacing w:after="120" w:line="276" w:lineRule="auto"/>
         <w:ind w:left="425.19685039370086" w:firstLine="0"/>
         <w:jc w:val="both"/>
         <w:rPr>
@@ -6009,31 +5959,6 @@
     <w:p>
       <w:pPr>
         <w:spacing w:after="120" w:line="276" w:lineRule="auto"/>
-        <w:ind w:left="708.6614173228347" w:firstLine="0"/>
-        <w:jc w:val="both"/>
-        <w:rPr>
-          <w:rFonts w:ascii="Arial" w:cs="Arial" w:eastAsia="Arial" w:hAnsi="Arial"/>
-          <w:i w:val="1"/>
-          <w:iCs w:val="1"/>
-          <w:sz w:val="22"/>
-          <w:szCs w:val="22"/>
-        </w:rPr>
-      </w:pPr>
-      <w:r>
-        <w:rPr>
-          <w:rFonts w:ascii="Arial" w:cs="Arial" w:eastAsia="Arial" w:hAnsi="Arial"/>
-          <w:i w:val="1"/>
-          <w:iCs w:val="1"/>
-          <w:sz w:val="22"/>
-          <w:szCs w:val="22"/>
-          <w:rtl w:val="0"/>
-        </w:rPr>
-        <w:t xml:space="preserve">*akun yang diperkenankan Belanja Bahan, Narasumber, Transport Lokal, Perjalanan Dinas Paket Meeting, Perjalanan Dinas Biasa</w:t>
-      </w:r>
-    </w:p>
-    <w:p>
-      <w:pPr>
-        <w:spacing w:after="120" w:line="276" w:lineRule="auto"/>
         <w:ind w:left="425.19685039370086" w:firstLine="0"/>
         <w:jc w:val="both"/>
         <w:rPr>
@@ -6459,31 +6384,6 @@
           <w:szCs w:val="22"/>
           <w:rtl w:val="0"/>
         </w:rPr>
-      </w:r>
-    </w:p>
-    <w:p>
-      <w:pPr>
-        <w:spacing w:after="120" w:line="276" w:lineRule="auto"/>
-        <w:ind w:left="850.3937007874017" w:firstLine="0"/>
-        <w:jc w:val="both"/>
-        <w:rPr>
-          <w:rFonts w:ascii="Arial" w:cs="Arial" w:eastAsia="Arial" w:hAnsi="Arial"/>
-          <w:i w:val="1"/>
-          <w:iCs w:val="1"/>
-          <w:sz w:val="22"/>
-          <w:szCs w:val="22"/>
-        </w:rPr>
-      </w:pPr>
-      <w:r>
-        <w:rPr>
-          <w:rFonts w:ascii="Arial" w:cs="Arial" w:eastAsia="Arial" w:hAnsi="Arial"/>
-          <w:i w:val="1"/>
-          <w:iCs w:val="1"/>
-          <w:sz w:val="22"/>
-          <w:szCs w:val="22"/>
-          <w:rtl w:val="0"/>
-        </w:rPr>
-        <w:t xml:space="preserve">*akun yang diperkenankan Belanja Bahan, Narasumber, Transport Lokal, Perjalanan Dinas Paket Meeting, Perjalanan Dinas Biasa</w:t>
       </w:r>
     </w:p>
     <w:p>
@@ -10884,7 +10784,7 @@
         <w:tabs>
           <w:tab w:val="left" w:leader="none" w:pos="360"/>
         </w:tabs>
-        <w:spacing w:after="40" w:before="0" w:line="360" w:lineRule="auto"/>
+        <w:spacing w:after="120" w:before="0" w:line="360" w:lineRule="auto"/>
         <w:ind w:left="360" w:right="0" w:hanging="360"/>
         <w:jc w:val="both"/>
         <w:rPr>
@@ -10921,7 +10821,7 @@
           <w:between w:space="0" w:sz="0" w:val="nil"/>
         </w:pBdr>
         <w:shd w:fill="auto" w:val="clear"/>
-        <w:spacing w:after="40" w:before="0" w:line="240" w:lineRule="auto"/>
+        <w:spacing w:after="160" w:before="0" w:line="240" w:lineRule="auto"/>
         <w:ind w:left="0" w:right="0" w:firstLine="0"/>
         <w:jc w:val="both"/>
         <w:rPr>
@@ -11118,7 +11018,7 @@
     </w:p>
     <w:p>
       <w:pPr>
-        <w:spacing w:after="40" w:line="276" w:lineRule="auto" w:before="0"/>
+        <w:spacing w:after="0" w:line="276" w:lineRule="auto"/>
         <w:ind w:left="4395" w:firstLine="0"/>
         <w:jc w:val="center"/>
         <w:rPr>
@@ -11154,7 +11054,7 @@
     </w:p>
     <w:p>
       <w:pPr>
-        <w:spacing w:after="40" w:line="276" w:lineRule="auto" w:before="0"/>
+        <w:spacing w:after="0" w:line="276" w:lineRule="auto"/>
         <w:ind w:left="4395" w:firstLine="0"/>
         <w:jc w:val="center"/>
         <w:rPr>
@@ -11190,11 +11090,52 @@
           <w:rtl w:val="0"/>
         </w:rPr>
       </w:r>
-      <w:r/>
-    </w:p>
-    <w:p>
-      <w:pPr>
-        <w:spacing w:after="40" w:line="360" w:lineRule="auto" w:before="0"/>
+      <w:r>
+        <w:drawing>
+          <wp:anchor allowOverlap="1" behindDoc="1" distB="0" distT="0" distL="0" distR="0" hidden="0" layoutInCell="1" locked="0" relativeHeight="0" simplePos="0">
+            <wp:simplePos x="0" y="0"/>
+            <wp:positionH relativeFrom="column">
+              <wp:posOffset>2809875</wp:posOffset>
+            </wp:positionH>
+            <wp:positionV relativeFrom="paragraph">
+              <wp:posOffset>40640</wp:posOffset>
+            </wp:positionV>
+            <wp:extent cx="1203325" cy="1205865"/>
+            <wp:effectExtent b="50149" l="50265" r="50265" t="50149"/>
+            <wp:wrapNone/>
+            <wp:docPr id="1936072893" name="image4.png"/>
+            <a:graphic>
+              <a:graphicData uri="http://schemas.openxmlformats.org/drawingml/2006/picture">
+                <pic:pic>
+                  <pic:nvPicPr>
+                    <pic:cNvPr id="0" name="image4.png"/>
+                    <pic:cNvPicPr preferRelativeResize="0"/>
+                  </pic:nvPicPr>
+                  <pic:blipFill>
+                    <a:blip r:embed="rId10"/>
+                    <a:srcRect b="0" l="0" r="0" t="0"/>
+                    <a:stretch>
+                      <a:fillRect/>
+                    </a:stretch>
+                  </pic:blipFill>
+                  <pic:spPr>
+                    <a:xfrm rot="300035">
+                      <a:off x="0" y="0"/>
+                      <a:ext cx="1203325" cy="1205865"/>
+                    </a:xfrm>
+                    <a:prstGeom prst="rect"/>
+                    <a:ln/>
+                  </pic:spPr>
+                </pic:pic>
+              </a:graphicData>
+            </a:graphic>
+          </wp:anchor>
+        </w:drawing>
+      </w:r>
+    </w:p>
+    <w:p>
+      <w:pPr>
+        <w:spacing w:after="0" w:line="360" w:lineRule="auto"/>
         <w:ind w:left="4395" w:firstLine="0"/>
         <w:jc w:val="center"/>
         <w:rPr>
@@ -11211,7 +11152,41 @@
     </w:p>
     <w:p>
       <w:pPr>
-        <w:spacing w:after="40" w:line="360" w:lineRule="auto" w:before="0"/>
+        <w:spacing w:after="0" w:line="360" w:lineRule="auto"/>
+        <w:ind w:left="4395" w:firstLine="0"/>
+        <w:jc w:val="center"/>
+        <w:rPr>
+          <w:rFonts w:ascii="Arial" w:cs="Arial" w:eastAsia="Arial" w:hAnsi="Arial"/>
+          <w:sz w:val="22"/>
+          <w:szCs w:val="22"/>
+        </w:rPr>
+      </w:pPr>
+      <w:r>
+        <w:rPr>
+          <w:rtl w:val="0"/>
+        </w:rPr>
+      </w:r>
+    </w:p>
+    <w:p>
+      <w:pPr>
+        <w:spacing w:after="0" w:line="360" w:lineRule="auto"/>
+        <w:ind w:left="4395" w:firstLine="0"/>
+        <w:jc w:val="center"/>
+        <w:rPr>
+          <w:rFonts w:ascii="Arial" w:cs="Arial" w:eastAsia="Arial" w:hAnsi="Arial"/>
+          <w:sz w:val="22"/>
+          <w:szCs w:val="22"/>
+        </w:rPr>
+      </w:pPr>
+      <w:r>
+        <w:rPr>
+          <w:rtl w:val="0"/>
+        </w:rPr>
+      </w:r>
+    </w:p>
+    <w:p>
+      <w:pPr>
+        <w:spacing w:after="120" w:line="360" w:lineRule="auto"/>
         <w:ind w:left="5799" w:firstLine="681.0000000000002"/>
         <w:jc w:val="both"/>
         <w:rPr>
@@ -11236,7 +11211,7 @@
     </w:p>
     <w:p>
       <w:pPr>
-        <w:spacing w:after="40" w:line="360" w:lineRule="auto" w:before="0"/>
+        <w:spacing w:after="120" w:line="360" w:lineRule="auto"/>
         <w:ind w:left="5799" w:firstLine="681.0000000000002"/>
         <w:jc w:val="both"/>
         <w:rPr>

</xml_diff>